<commit_message>
docs(dashboard): balance the design brief across all three pages
Sections 3/5/6/7 all leaned on page 3. Section 3 now carries one
paragraph per page, section 5 states the counting unit for ad and web
metrics side by side, section 6 describes each page's viewing unit, and
section 7 splits its limits into ad data (1-2p) and web data (3p).

Co-Authored-By: Claude Opus 5 <noreply@anthropic.com>
</commit_message>
<xml_diff>
--- a/docs/dashboard/대시보드_설계서.docx
+++ b/docs/dashboard/대시보드_설계서.docx
@@ -877,6 +877,33 @@
           <w:sz w:val="18"/>
           <w:szCs w:val="18"/>
         </w:rPr>
+        <w:t xml:space="preserve">1페이지는 캠페인 전체를 한 줄로 연결.</w:t>
+      </w:r>
+      <w:r>
+        <w:rPr>
+          <w:rFonts w:ascii="맑은 고딕" w:cs="맑은 고딕" w:eastAsia="맑은 고딕" w:hAnsi="맑은 고딕"/>
+          <w:b w:val="false"/>
+          <w:bCs w:val="false"/>
+          <w:color w:val="595959"/>
+          <w:sz w:val="18"/>
+          <w:szCs w:val="18"/>
+        </w:rPr>
+        <w:t xml:space="preserve"> 노출 → 도달 → 링크 클릭 → 페이지 방문 → 예약 유도까지 단계별 잔존을 하나의 흐름으로 배치하고, 예산·광고 성과·웹 행동·예약 유도·효율을 다섯 칸으로 요약. 마지막 칸의 유도당 비용이 캠페인 지속 여부 판단의 기준값.</w:t>
+      </w:r>
+    </w:p>
+    <w:p>
+      <w:pPr>
+        <w:spacing w:after="70" w:before="0" w:line="274"/>
+      </w:pPr>
+      <w:r>
+        <w:rPr>
+          <w:rFonts w:ascii="맑은 고딕" w:cs="맑은 고딕" w:eastAsia="맑은 고딕" w:hAnsi="맑은 고딕"/>
+          <w:b/>
+          <w:bCs/>
+          <w:color w:val="000000"/>
+          <w:sz w:val="18"/>
+          <w:szCs w:val="18"/>
+        </w:rPr>
         <w:t xml:space="preserve">2페이지는 광고 자체의 성과만 취급.</w:t>
       </w:r>
       <w:r>
@@ -889,6 +916,33 @@
           <w:szCs w:val="18"/>
         </w:rPr>
         <w:t xml:space="preserve"> 상단 KPI에서 CTR·CPC·클릭·노출을 확인하고, 4분면 차트로 반응이 좋으면서 단가가 싼 소재를 위치로 선별한 뒤, 드릴다운으로 소재가 좋아서 성과가 난 것인지 좋은 자리에 나가서 난 것인지를 구분. 이 세 가지로 다음 캠페인의 예산 이동 방향을 결정.</w:t>
+      </w:r>
+    </w:p>
+    <w:p>
+      <w:pPr>
+        <w:spacing w:after="70" w:before="0" w:line="274"/>
+      </w:pPr>
+      <w:r>
+        <w:rPr>
+          <w:rFonts w:ascii="맑은 고딕" w:cs="맑은 고딕" w:eastAsia="맑은 고딕" w:hAnsi="맑은 고딕"/>
+          <w:b/>
+          <w:bCs/>
+          <w:color w:val="000000"/>
+          <w:sz w:val="18"/>
+          <w:szCs w:val="18"/>
+        </w:rPr>
+        <w:t xml:space="preserve">3페이지는 광고 이후의 행동만 취급.</w:t>
+      </w:r>
+      <w:r>
+        <w:rPr>
+          <w:rFonts w:ascii="맑은 고딕" w:cs="맑은 고딕" w:eastAsia="맑은 고딕" w:hAnsi="맑은 고딕"/>
+          <w:b w:val="false"/>
+          <w:bCs w:val="false"/>
+          <w:color w:val="595959"/>
+          <w:sz w:val="18"/>
+          <w:szCs w:val="18"/>
+        </w:rPr>
+        <w:t xml:space="preserve"> 방문자 → 의미 있는 행동 → CTA 클릭 → 예약 유도로 이어지는 "방문 후 행동 흐름"이 축. 예약 유도 90명, 방문자 대비 1.11%라는 숫자만 보면 낮아 보이지만 흐름과 함께 보면 사람들이 어느 단계에서 멈추는지가 드러남. 이번 기간에는 방문 직후 단계에서 가장 많이 멈췄고, CTA를 누른 사람의 81.8%는 예약 의사를 표현하는 행동(예약 메시지 보내기·전화 걸기)까지 이어짐.</w:t>
       </w:r>
     </w:p>
     <w:p>
@@ -1146,6 +1200,45 @@
     </w:p>
     <w:p>
       <w:pPr>
+        <w:spacing w:after="45" w:before="0" w:line="274"/>
+        <w:ind w:left="200" w:hanging="200"/>
+      </w:pPr>
+      <w:r>
+        <w:rPr>
+          <w:rFonts w:ascii="맑은 고딕" w:cs="맑은 고딕" w:eastAsia="맑은 고딕" w:hAnsi="맑은 고딕"/>
+          <w:b w:val="false"/>
+          <w:bCs w:val="false"/>
+          <w:color w:val="595959"/>
+          <w:sz w:val="18"/>
+          <w:szCs w:val="18"/>
+        </w:rPr>
+        <w:t xml:space="preserve">- </w:t>
+      </w:r>
+      <w:r>
+        <w:rPr>
+          <w:rFonts w:ascii="맑은 고딕" w:cs="맑은 고딕" w:eastAsia="맑은 고딕" w:hAnsi="맑은 고딕"/>
+          <w:b/>
+          <w:bCs/>
+          <w:color w:val="000000"/>
+          <w:sz w:val="18"/>
+          <w:szCs w:val="18"/>
+        </w:rPr>
+        <w:t xml:space="preserve">세는 단위 </w:t>
+      </w:r>
+      <w:r>
+        <w:rPr>
+          <w:rFonts w:ascii="맑은 고딕" w:cs="맑은 고딕" w:eastAsia="맑은 고딕" w:hAnsi="맑은 고딕"/>
+          <w:b w:val="false"/>
+          <w:bCs w:val="false"/>
+          <w:color w:val="000000"/>
+          <w:sz w:val="18"/>
+          <w:szCs w:val="18"/>
+        </w:rPr>
+        <w:t xml:space="preserve">— 광고 지표(노출·클릭·비용)는 Meta 집계 기준, 웹 지표(방문자·행동·CTA·예약 유도)는 사람 수(고유 기기) 기준. 한 사람이 여러 번 눌러도 1명.</w:t>
+      </w:r>
+    </w:p>
+    <w:p>
+      <w:pPr>
         <w:spacing w:after="70" w:before="70" w:line="274"/>
       </w:pPr>
       <w:r>
@@ -1157,23 +1250,7 @@
           <w:sz w:val="18"/>
           <w:szCs w:val="18"/>
         </w:rPr>
-        <w:t xml:space="preserve">3페이지의 핵심은 방문자 → 의미 있는 행동 → CTA 클릭 → 예약 유도로 이어지는 "방문 후 행동 흐름". 예약 유도 90명, 방문자 대비 1.11%라는 숫자만 보면 낮아 보이지만, 흐름과 함께 보면 사람들이 어느 행동 단계에서 멈추는지가 드러남. 이번 기간에는 방문 직후 단계에서 가장 많이 멈췄고, CTA를 누른 사람의 81.8%는 예약 의사를 표현하는 행동(예약 메시지 보내기·전화 걸기)까지 이어짐.</w:t>
-      </w:r>
-    </w:p>
-    <w:p>
-      <w:pPr>
-        <w:spacing w:after="70" w:before="0" w:line="274"/>
-      </w:pPr>
-      <w:r>
-        <w:rPr>
-          <w:rFonts w:ascii="맑은 고딕" w:cs="맑은 고딕" w:eastAsia="맑은 고딕" w:hAnsi="맑은 고딕"/>
-          <w:b w:val="false"/>
-          <w:bCs w:val="false"/>
-          <w:color w:val="595959"/>
-          <w:sz w:val="18"/>
-          <w:szCs w:val="18"/>
-        </w:rPr>
-        <w:t xml:space="preserve">화면은 기본적으로 한 장 유지. 소재별 성과표와 다음 운영 개선은 접어 두고 필요할 때 버튼으로 펼치는 방식. 매일 확인하는 화면에 글이 많으면 정작 봐야 할 숫자가 묻히기 때문.</w:t>
+        <w:t xml:space="preserve">화면은 세 페이지 모두 기본적으로 한 장 유지. 2페이지의 소재 드릴다운, 3페이지의 소재별 성과표와 다음 운영 개선은 접어 두고 필요할 때 버튼으로 펼치는 방식. 매일 확인하는 화면에 글이 많으면 정작 봐야 할 숫자가 묻히기 때문.</w:t>
       </w:r>
     </w:p>
     <w:p>
@@ -1651,7 +1728,7 @@
           <w:sz w:val="18"/>
           <w:szCs w:val="18"/>
         </w:rPr>
-        <w:t xml:space="preserve">3페이지는 기간을 전체·1차·2차뿐 아니라 특정 하루만 골라 볼 수 있고, 하루를 고르면 전일 대비 변화가 함께 표시됨. 방문자와 세션은 변화율(%)로, 행동과 예약 유도는 사람 수 차이로 표시. 하루 예약 의사 표현이 1~12명 수준이라 비율 변화는 표본에 따라 크게 흔들리기 때문.</w:t>
+        <w:t xml:space="preserve">보는 단위는 페이지마다 다름. 1페이지는 기간 전체 고정 요약으로 보고용, 2페이지는 소재·광고세트 단위로 좁혀 보는 비교용, 3페이지는 기간(전체·1차·2차)뿐 아니라 특정 하루만 골라 보는 일상 점검용. 3페이지에서 하루를 고르면 전일 대비 변화가 함께 표시되며, 방문자와 세션은 변화율(%)로, 행동과 예약 유도는 사람 수 차이로 표시. 하루 예약 의사 표현이 1~12명 수준이라 비율 변화는 표본에 따라 크게 흔들리기 때문.</w:t>
       </w:r>
     </w:p>
     <w:p>
@@ -1667,7 +1744,7 @@
           <w:sz w:val="18"/>
           <w:szCs w:val="18"/>
         </w:rPr>
-        <w:t xml:space="preserve">데이터만으로 원인을 확정할 수 없는 경우 "문제 원인"이 아니라 "우선 점검 영역" 또는 "개선 가설"로 표현. 3페이지의 운영 체크포인트도 같은 원칙.</w:t>
+        <w:t xml:space="preserve">데이터만으로 원인을 확정할 수 없는 경우 세 페이지 모두 "문제 원인"이 아니라 "우선 점검 영역" 또는 "개선 가설"로 표현.</w:t>
       </w:r>
     </w:p>
     <w:p>
@@ -1705,6 +1782,22 @@
     </w:p>
     <w:p>
       <w:pPr>
+        <w:spacing w:after="40" w:before="60" w:line="274"/>
+      </w:pPr>
+      <w:r>
+        <w:rPr>
+          <w:rFonts w:ascii="맑은 고딕" w:cs="맑은 고딕" w:eastAsia="맑은 고딕" w:hAnsi="맑은 고딕"/>
+          <w:b/>
+          <w:bCs/>
+          <w:color w:val="000000"/>
+          <w:sz w:val="17"/>
+          <w:szCs w:val="17"/>
+        </w:rPr>
+        <w:t xml:space="preserve">광고 데이터 (1·2페이지)</w:t>
+      </w:r>
+    </w:p>
+    <w:p>
+      <w:pPr>
         <w:spacing w:after="45" w:before="0" w:line="274"/>
         <w:ind w:left="200" w:hanging="200"/>
       </w:pPr>
@@ -1728,18 +1821,18 @@
           <w:sz w:val="18"/>
           <w:szCs w:val="18"/>
         </w:rPr>
-        <w:t xml:space="preserve">실제 예약 성사 여부 확인 불가. </w:t>
-      </w:r>
-      <w:r>
-        <w:rPr>
-          <w:rFonts w:ascii="맑은 고딕" w:cs="맑은 고딕" w:eastAsia="맑은 고딕" w:hAnsi="맑은 고딕"/>
-          <w:b w:val="false"/>
-          <w:bCs w:val="false"/>
-          <w:color w:val="000000"/>
-          <w:sz w:val="18"/>
-          <w:szCs w:val="18"/>
-        </w:rPr>
-        <w:t xml:space="preserve">예약 시스템과 연동되어 있지 않아 "예약 유도"는 예약 의사를 표현하는 버튼(예약 메시지 보내기·전화 걸기)을 누른 것까지. 버튼 문구가 Nhắn tin đặt bàn(테이블 예약 메시지 보내기)이라 의도는 분명하나, 실제 예약·방문·결제와 동일하게 해석하지 않음.</w:t>
+        <w:t xml:space="preserve">도달은 기간 합산 불가. </w:t>
+      </w:r>
+      <w:r>
+        <w:rPr>
+          <w:rFonts w:ascii="맑은 고딕" w:cs="맑은 고딕" w:eastAsia="맑은 고딕" w:hAnsi="맑은 고딕"/>
+          <w:b w:val="false"/>
+          <w:bCs w:val="false"/>
+          <w:color w:val="000000"/>
+          <w:sz w:val="18"/>
+          <w:szCs w:val="18"/>
+        </w:rPr>
+        <w:t xml:space="preserve">Meta가 조회 기간마다 중복을 제거해 다시 계산하므로 일자별 도달을 더할 수 없음. 1페이지의 도달 213,946명은 13일 기준값이며 각주로 명시.</w:t>
       </w:r>
     </w:p>
     <w:p>
@@ -1767,18 +1860,34 @@
           <w:sz w:val="18"/>
           <w:szCs w:val="18"/>
         </w:rPr>
-        <w:t xml:space="preserve">메신저 전송 성공 여부 확인 불가. </w:t>
-      </w:r>
-      <w:r>
-        <w:rPr>
-          <w:rFonts w:ascii="맑은 고딕" w:cs="맑은 고딕" w:eastAsia="맑은 고딕" w:hAnsi="맑은 고딕"/>
-          <w:b w:val="false"/>
-          <w:bCs w:val="false"/>
-          <w:color w:val="000000"/>
-          <w:sz w:val="18"/>
-          <w:szCs w:val="18"/>
-        </w:rPr>
-        <w:t xml:space="preserve">버튼 클릭 이후 실제 메시지 발송 여부는 측정 범위 밖.</w:t>
+        <w:t xml:space="preserve">광고 클릭과 페이지 방문은 서로 다른 시스템의 집계. </w:t>
+      </w:r>
+      <w:r>
+        <w:rPr>
+          <w:rFonts w:ascii="맑은 고딕" w:cs="맑은 고딕" w:eastAsia="맑은 고딕" w:hAnsi="맑은 고딕"/>
+          <w:b w:val="false"/>
+          <w:bCs w:val="false"/>
+          <w:color w:val="000000"/>
+          <w:sz w:val="18"/>
+          <w:szCs w:val="18"/>
+        </w:rPr>
+        <w:t xml:space="preserve">Meta의 클릭 수와 웹 계측의 방문자 수는 1:1로 대응하지 않으므로 "클릭→방문 55.5%"는 두 시스템 대조값이며 오차 포함.</w:t>
+      </w:r>
+    </w:p>
+    <w:p>
+      <w:pPr>
+        <w:spacing w:after="40" w:before="90" w:line="274"/>
+      </w:pPr>
+      <w:r>
+        <w:rPr>
+          <w:rFonts w:ascii="맑은 고딕" w:cs="맑은 고딕" w:eastAsia="맑은 고딕" w:hAnsi="맑은 고딕"/>
+          <w:b/>
+          <w:bCs/>
+          <w:color w:val="000000"/>
+          <w:sz w:val="17"/>
+          <w:szCs w:val="17"/>
+        </w:rPr>
+        <w:t xml:space="preserve">웹 데이터 (3페이지)</w:t>
       </w:r>
     </w:p>
     <w:p>
@@ -1806,18 +1915,18 @@
           <w:sz w:val="18"/>
           <w:szCs w:val="18"/>
         </w:rPr>
-        <w:t xml:space="preserve">페이지 내 이탈 지점 확인 불가. </w:t>
-      </w:r>
-      <w:r>
-        <w:rPr>
-          <w:rFonts w:ascii="맑은 고딕" w:cs="맑은 고딕" w:eastAsia="맑은 고딕" w:hAnsi="맑은 고딕"/>
-          <w:b w:val="false"/>
-          <w:bCs w:val="false"/>
-          <w:color w:val="000000"/>
-          <w:sz w:val="18"/>
-          <w:szCs w:val="18"/>
-        </w:rPr>
-        <w:t xml:space="preserve">스크롤 깊이 미계측. 이에 따라 퍼널을 "이탈 위치 분석"이 아니라 "방문 후 행동 흐름"으로 정의.</w:t>
+        <w:t xml:space="preserve">실제 예약 성사 여부 확인 불가. </w:t>
+      </w:r>
+      <w:r>
+        <w:rPr>
+          <w:rFonts w:ascii="맑은 고딕" w:cs="맑은 고딕" w:eastAsia="맑은 고딕" w:hAnsi="맑은 고딕"/>
+          <w:b w:val="false"/>
+          <w:bCs w:val="false"/>
+          <w:color w:val="000000"/>
+          <w:sz w:val="18"/>
+          <w:szCs w:val="18"/>
+        </w:rPr>
+        <w:t xml:space="preserve">예약 시스템과 연동되어 있지 않아 "예약 유도"는 예약 의사를 표현하는 버튼(예약 메시지 보내기·전화 걸기)을 누른 것까지. 버튼 문구가 Nhắn tin đặt bàn(테이블 예약 메시지 보내기)이라 의도는 분명하나, 실제 예약·방문·결제와 동일하게 해석하지 않음.</w:t>
       </w:r>
     </w:p>
     <w:p>
@@ -1845,57 +1954,18 @@
           <w:sz w:val="18"/>
           <w:szCs w:val="18"/>
         </w:rPr>
-        <w:t xml:space="preserve">Navigation 클릭은 이탈 위치가 아님. </w:t>
-      </w:r>
-      <w:r>
-        <w:rPr>
-          <w:rFonts w:ascii="맑은 고딕" w:cs="맑은 고딕" w:eastAsia="맑은 고딕" w:hAnsi="맑은 고딕"/>
-          <w:b w:val="false"/>
-          <w:bCs w:val="false"/>
-          <w:color w:val="000000"/>
-          <w:sz w:val="18"/>
-          <w:szCs w:val="18"/>
-        </w:rPr>
-        <w:t xml:space="preserve">특정 섹션으로 이동하려는 관심을 나타내는 보조 지표로만 사용.</w:t>
-      </w:r>
-    </w:p>
-    <w:p>
-      <w:pPr>
-        <w:spacing w:after="45" w:before="0" w:line="274"/>
-        <w:ind w:left="200" w:hanging="200"/>
-      </w:pPr>
-      <w:r>
-        <w:rPr>
-          <w:rFonts w:ascii="맑은 고딕" w:cs="맑은 고딕" w:eastAsia="맑은 고딕" w:hAnsi="맑은 고딕"/>
-          <w:b w:val="false"/>
-          <w:bCs w:val="false"/>
-          <w:color w:val="595959"/>
-          <w:sz w:val="18"/>
-          <w:szCs w:val="18"/>
-        </w:rPr>
-        <w:t xml:space="preserve">- </w:t>
-      </w:r>
-      <w:r>
-        <w:rPr>
-          <w:rFonts w:ascii="맑은 고딕" w:cs="맑은 고딕" w:eastAsia="맑은 고딕" w:hAnsi="맑은 고딕"/>
-          <w:b/>
-          <w:bCs/>
-          <w:color w:val="000000"/>
-          <w:sz w:val="18"/>
-          <w:szCs w:val="18"/>
-        </w:rPr>
-        <w:t xml:space="preserve">숫자는 사람 수. </w:t>
-      </w:r>
-      <w:r>
-        <w:rPr>
-          <w:rFonts w:ascii="맑은 고딕" w:cs="맑은 고딕" w:eastAsia="맑은 고딕" w:hAnsi="맑은 고딕"/>
-          <w:b w:val="false"/>
-          <w:bCs w:val="false"/>
-          <w:color w:val="000000"/>
-          <w:sz w:val="18"/>
-          <w:szCs w:val="18"/>
-        </w:rPr>
-        <w:t xml:space="preserve">방문자·행동·CTA·예약 유도 모두 고유 기기 기준. 클릭 횟수가 아니며 한 사람이 여러 번 눌러도 1명. 예약 유도 90명이 누른 횟수는 106건. 대시보드의 물음표 표시를 누르면 각 단계의 정의 확인 가능.</w:t>
+        <w:t xml:space="preserve">클릭 이후는 확인 불가. </w:t>
+      </w:r>
+      <w:r>
+        <w:rPr>
+          <w:rFonts w:ascii="맑은 고딕" w:cs="맑은 고딕" w:eastAsia="맑은 고딕" w:hAnsi="맑은 고딕"/>
+          <w:b w:val="false"/>
+          <w:bCs w:val="false"/>
+          <w:color w:val="000000"/>
+          <w:sz w:val="18"/>
+          <w:szCs w:val="18"/>
+        </w:rPr>
+        <w:t xml:space="preserve">메신저 실제 발송 여부, 페이지 내 이탈 지점(스크롤 깊이 미계측) 모두 측정 범위 밖. 이에 따라 퍼널을 "이탈 위치 분석"이 아니라 "방문 후 행동 흐름"으로 정의하고, 내비게이션 클릭도 이탈 위치가 아닌 관심 표시로만 사용.</w:t>
       </w:r>
     </w:p>
     <w:p>
@@ -1929,25 +1999,6 @@
           <w:szCs w:val="19"/>
         </w:rPr>
         <w:t xml:space="preserve">캠페인 성과부터 광고별 성과, 랜딩페이지에서의 고객 행동과 예약 의사 표현까지 하나로 이어 보여주어, 다음에 어디에 예산을 쓰고 무엇을 고칠지 바로 정할 수 있게 만든 마케팅 운영 대시보드.</w:t>
-      </w:r>
-    </w:p>
-    <w:p>
-      <w:pPr>
-        <w:pBdr>
-          <w:bottom w:val="single" w:color="BFBFBF" w:sz="6"/>
-        </w:pBdr>
-        <w:spacing w:after="0" w:before="280" w:line="274"/>
-      </w:pPr>
-      <w:r>
-        <w:rPr>
-          <w:rFonts w:ascii="맑은 고딕" w:cs="맑은 고딕" w:eastAsia="맑은 고딕" w:hAnsi="맑은 고딕"/>
-          <w:b w:val="false"/>
-          <w:bCs w:val="false"/>
-          <w:color w:val="595959"/>
-          <w:sz w:val="15"/>
-          <w:szCs w:val="15"/>
-        </w:rPr>
-        <w:t xml:space="preserve">검증 · 방문자 8,084명 / 세션 9,505 / 의미 있는 행동 150명 / CTA 110명 / 예약 유도 90명 — 모두 고유 사용자 기준, 원본 집계와 일치</w:t>
       </w:r>
     </w:p>
     <w:sectPr>

</xml_diff>